<commit_message>
Module 4b: fat tails with rare crashes (jump-diffusion VaR)
Add a Merton-style crash model: a -25% crash about once every 10 years,
drift compensated so the average return stays mu. The number of crashes is
the Poisson limit of crash coin-flips; the loss distribution becomes a
mixture of bell curves whose quantile is found by bisection, and a second
bisection finds f_crash = 0.617 (vs f_VaR = 0.705). With lam = 0 everything
reduces to Module 4.

Python (src/risk.py, main.py, fig5, 4 new tests), MATLAB mirror (6 new
files, main.m, run_tests.m), web tab 2 crash panel, README, report and
Methodology updated.

Co-Authored-By: Claude Opus 5.5 <noreply@anthropic.com>
</commit_message>
<xml_diff>
--- a/report/Methodology.docx
+++ b/report/Methodology.docx
@@ -7065,6 +7065,1051 @@
     </w:p>
     <w:p>
       <w:pPr>
+        <w:pStyle w:val="Heading3"/>
+      </w:pPr>
+      <w:r>
+        <w:t xml:space="preserve">3.4.6 Fat tails: allocation when rare crashes can happen</w:t>
+      </w:r>
+    </w:p>
+    <w:p>
+      <w:r>
+        <w:t xml:space="preserve">Normal log-returns make large losses almost impossible, whereas real markets occasionally crash. To measure how much this matters, the stock is extended to a jump-diffusion in the spirit of Merton (1976). Crashes arrive at an average rate </w:t>
+      </w:r>
+      <m:oMath>
+        <m:r>
+          <w:rPr>
+            <w:rFonts w:ascii="Cambria Math" w:hAnsi="Cambria Math"/>
+          </w:rPr>
+          <m:t xml:space="preserve">λ</m:t>
+        </m:r>
+      </m:oMath>
+      <w:r>
+        <w:t xml:space="preserve"> per year, and each multiplies the stock price by </w:t>
+      </w:r>
+      <m:oMath>
+        <m:r>
+          <w:rPr>
+            <w:rFonts w:ascii="Cambria Math" w:hAnsi="Cambria Math"/>
+          </w:rPr>
+          <m:t xml:space="preserve">1+J</m:t>
+        </m:r>
+      </m:oMath>
+      <w:r>
+        <w:t xml:space="preserve"> (J &lt; 0). The drift is reduced by </w:t>
+      </w:r>
+      <m:oMath>
+        <m:r>
+          <w:rPr>
+            <w:rFonts w:ascii="Cambria Math" w:hAnsi="Cambria Math"/>
+          </w:rPr>
+          <m:t xml:space="preserve">λJ</m:t>
+        </m:r>
+      </m:oMath>
+      <w:r>
+        <w:t xml:space="preserve">, so the expected return is still </w:t>
+      </w:r>
+      <m:oMath>
+        <m:r>
+          <w:rPr>
+            <w:rFonts w:ascii="Cambria Math" w:hAnsi="Cambria Math"/>
+          </w:rPr>
+          <m:t xml:space="preserve">μ</m:t>
+        </m:r>
+      </m:oMath>
+      <w:r>
+        <w:t xml:space="preserve">: only the shape of the distribution changes, not its mean. With N crashes in T years and continuous rebalancing,</w:t>
+      </w:r>
+    </w:p>
+    <w:tbl>
+      <w:tblPr>
+        <w:tblW w:w="9026" w:type="dxa"/>
+        <w:tblBorders>
+          <w:top w:val="nil"/>
+          <w:left w:val="nil"/>
+          <w:bottom w:val="nil"/>
+          <w:right w:val="nil"/>
+          <w:insideH w:val="nil"/>
+          <w:insideV w:val="nil"/>
+        </w:tblBorders>
+        <w:tblLayout w:type="fixed"/>
+      </w:tblPr>
+      <w:tblGrid>
+        <w:gridCol w:w="8126"/>
+        <w:gridCol w:w="900"/>
+      </w:tblGrid>
+      <w:tr>
+        <w:tc>
+          <w:tcPr>
+            <w:tcW w:w="8126" w:type="dxa"/>
+            <w:vAlign w:val="center"/>
+          </w:tcPr>
+          <w:p>
+            <w:pPr>
+              <w:pStyle w:val="Equation"/>
+            </w:pPr>
+            <m:oMathPara>
+              <m:oMath>
+                <m:func>
+                  <m:fName>
+                    <m:r>
+                      <m:rPr>
+                        <m:sty m:val="p"/>
+                      </m:rPr>
+                      <w:rPr>
+                        <w:rFonts w:ascii="Cambria Math" w:hAnsi="Cambria Math"/>
+                      </w:rPr>
+                      <m:t xml:space="preserve">ln</m:t>
+                    </m:r>
+                  </m:fName>
+                  <m:e>
+                    <m:f>
+                      <m:num>
+                        <m:sSub>
+                          <m:e>
+                            <m:r>
+                              <w:rPr>
+                                <w:rFonts w:ascii="Cambria Math" w:hAnsi="Cambria Math"/>
+                              </w:rPr>
+                              <m:t xml:space="preserve">W</m:t>
+                            </m:r>
+                          </m:e>
+                          <m:sub>
+                            <m:r>
+                              <w:rPr>
+                                <w:rFonts w:ascii="Cambria Math" w:hAnsi="Cambria Math"/>
+                              </w:rPr>
+                              <m:t xml:space="preserve">T</m:t>
+                            </m:r>
+                          </m:sub>
+                        </m:sSub>
+                      </m:num>
+                      <m:den>
+                        <m:sSub>
+                          <m:e>
+                            <m:r>
+                              <w:rPr>
+                                <w:rFonts w:ascii="Cambria Math" w:hAnsi="Cambria Math"/>
+                              </w:rPr>
+                              <m:t xml:space="preserve">W</m:t>
+                            </m:r>
+                          </m:e>
+                          <m:sub>
+                            <m:r>
+                              <w:rPr>
+                                <w:rFonts w:ascii="Cambria Math" w:hAnsi="Cambria Math"/>
+                              </w:rPr>
+                              <m:t xml:space="preserve">0</m:t>
+                            </m:r>
+                          </m:sub>
+                        </m:sSub>
+                      </m:den>
+                    </m:f>
+                  </m:e>
+                </m:func>
+                <m:r>
+                  <w:rPr>
+                    <w:rFonts w:ascii="Cambria Math" w:hAnsi="Cambria Math"/>
+                  </w:rPr>
+                  <m:t xml:space="preserve">=</m:t>
+                </m:r>
+                <m:d>
+                  <m:dPr>
+                    <m:begChr m:val="("/>
+                    <m:endChr m:val=")"/>
+                  </m:dPr>
+                  <m:e>
+                    <m:r>
+                      <w:rPr>
+                        <w:rFonts w:ascii="Cambria Math" w:hAnsi="Cambria Math"/>
+                      </w:rPr>
+                      <m:t xml:space="preserve">g</m:t>
+                    </m:r>
+                    <m:d>
+                      <m:dPr>
+                        <m:begChr m:val="("/>
+                        <m:endChr m:val=")"/>
+                      </m:dPr>
+                      <m:e>
+                        <m:r>
+                          <w:rPr>
+                            <w:rFonts w:ascii="Cambria Math" w:hAnsi="Cambria Math"/>
+                          </w:rPr>
+                          <m:t xml:space="preserve">f</m:t>
+                        </m:r>
+                      </m:e>
+                    </m:d>
+                    <m:r>
+                      <w:rPr>
+                        <w:rFonts w:ascii="Cambria Math" w:hAnsi="Cambria Math"/>
+                      </w:rPr>
+                      <m:t xml:space="preserve">−λJf</m:t>
+                    </m:r>
+                  </m:e>
+                </m:d>
+                <m:r>
+                  <w:rPr>
+                    <w:rFonts w:ascii="Cambria Math" w:hAnsi="Cambria Math"/>
+                  </w:rPr>
+                  <m:t xml:space="preserve">T+N</m:t>
+                </m:r>
+                <m:func>
+                  <m:fName>
+                    <m:r>
+                      <m:rPr>
+                        <m:sty m:val="p"/>
+                      </m:rPr>
+                      <w:rPr>
+                        <w:rFonts w:ascii="Cambria Math" w:hAnsi="Cambria Math"/>
+                      </w:rPr>
+                      <m:t xml:space="preserve">ln</m:t>
+                    </m:r>
+                  </m:fName>
+                  <m:e>
+                    <m:d>
+                      <m:dPr>
+                        <m:begChr m:val="("/>
+                        <m:endChr m:val=")"/>
+                      </m:dPr>
+                      <m:e>
+                        <m:r>
+                          <w:rPr>
+                            <w:rFonts w:ascii="Cambria Math" w:hAnsi="Cambria Math"/>
+                          </w:rPr>
+                          <m:t xml:space="preserve">1+fJ</m:t>
+                        </m:r>
+                      </m:e>
+                    </m:d>
+                  </m:e>
+                </m:func>
+                <m:r>
+                  <w:rPr>
+                    <w:rFonts w:ascii="Cambria Math" w:hAnsi="Cambria Math"/>
+                  </w:rPr>
+                  <m:t xml:space="preserve">+fσ</m:t>
+                </m:r>
+                <m:rad>
+                  <m:radPr>
+                    <m:degHide m:val="1"/>
+                  </m:radPr>
+                  <m:deg/>
+                  <m:e>
+                    <m:r>
+                      <w:rPr>
+                        <w:rFonts w:ascii="Cambria Math" w:hAnsi="Cambria Math"/>
+                      </w:rPr>
+                      <m:t xml:space="preserve">T</m:t>
+                    </m:r>
+                  </m:e>
+                </m:rad>
+                <m:r>
+                  <w:rPr>
+                    <w:rFonts w:ascii="Cambria Math" w:hAnsi="Cambria Math"/>
+                  </w:rPr>
+                  <m:t xml:space="preserve">Z,    N~</m:t>
+                </m:r>
+                <m:r>
+                  <m:rPr>
+                    <m:sty m:val="p"/>
+                  </m:rPr>
+                  <w:rPr>
+                    <w:rFonts w:ascii="Cambria Math" w:hAnsi="Cambria Math"/>
+                  </w:rPr>
+                  <m:t xml:space="preserve">Poisson</m:t>
+                </m:r>
+                <m:d>
+                  <m:dPr>
+                    <m:begChr m:val="("/>
+                    <m:endChr m:val=")"/>
+                  </m:dPr>
+                  <m:e>
+                    <m:r>
+                      <w:rPr>
+                        <w:rFonts w:ascii="Cambria Math" w:hAnsi="Cambria Math"/>
+                      </w:rPr>
+                      <m:t xml:space="preserve">λT</m:t>
+                    </m:r>
+                  </m:e>
+                </m:d>
+                <m:r>
+                  <w:rPr>
+                    <w:rFonts w:ascii="Cambria Math" w:hAnsi="Cambria Math"/>
+                  </w:rPr>
+                  <m:t xml:space="preserve">.</m:t>
+                </m:r>
+              </m:oMath>
+            </m:oMathPara>
+          </w:p>
+        </w:tc>
+        <w:tc>
+          <w:tcPr>
+            <w:tcW w:w="900" w:type="dxa"/>
+            <w:vAlign w:val="center"/>
+          </w:tcPr>
+          <w:p>
+            <w:pPr>
+              <w:pStyle w:val="Equation"/>
+              <w:jc w:val="right"/>
+            </w:pPr>
+            <w:r>
+              <w:t xml:space="preserve">(21)</w:t>
+            </w:r>
+          </w:p>
+        </w:tc>
+      </w:tr>
+    </w:tbl>
+    <w:p>
+      <w:r>
+        <w:t xml:space="preserve">The Poisson law is itself a limit. If a crash can happen in each of n steps of a year with probability λ/n, the number of crashes is binomial, and</w:t>
+      </w:r>
+    </w:p>
+    <w:tbl>
+      <w:tblPr>
+        <w:tblW w:w="9026" w:type="dxa"/>
+        <w:tblBorders>
+          <w:top w:val="nil"/>
+          <w:left w:val="nil"/>
+          <w:bottom w:val="nil"/>
+          <w:right w:val="nil"/>
+          <w:insideH w:val="nil"/>
+          <w:insideV w:val="nil"/>
+        </w:tblBorders>
+        <w:tblLayout w:type="fixed"/>
+      </w:tblPr>
+      <w:tblGrid>
+        <w:gridCol w:w="8126"/>
+        <w:gridCol w:w="900"/>
+      </w:tblGrid>
+      <w:tr>
+        <w:tc>
+          <w:tcPr>
+            <w:tcW w:w="8126" w:type="dxa"/>
+            <w:vAlign w:val="center"/>
+          </w:tcPr>
+          <w:p>
+            <w:pPr>
+              <w:pStyle w:val="Equation"/>
+            </w:pPr>
+            <m:oMathPara>
+              <m:oMath>
+                <m:func>
+                  <m:fName>
+                    <m:limLow>
+                      <m:e>
+                        <m:r>
+                          <m:rPr>
+                            <m:sty m:val="p"/>
+                          </m:rPr>
+                          <w:rPr>
+                            <w:rFonts w:ascii="Cambria Math" w:hAnsi="Cambria Math"/>
+                          </w:rPr>
+                          <m:t xml:space="preserve">lim</m:t>
+                        </m:r>
+                      </m:e>
+                      <m:lim>
+                        <m:r>
+                          <w:rPr>
+                            <w:rFonts w:ascii="Cambria Math" w:hAnsi="Cambria Math"/>
+                          </w:rPr>
+                          <m:t xml:space="preserve">n→∞</m:t>
+                        </m:r>
+                      </m:lim>
+                    </m:limLow>
+                  </m:fName>
+                  <m:e>
+                    <m:r>
+                      <m:rPr>
+                        <m:sty m:val="p"/>
+                      </m:rPr>
+                      <w:rPr>
+                        <w:rFonts w:ascii="Cambria Math" w:hAnsi="Cambria Math"/>
+                      </w:rPr>
+                      <m:t xml:space="preserve">Bin</m:t>
+                    </m:r>
+                    <m:d>
+                      <m:dPr>
+                        <m:begChr m:val="("/>
+                        <m:endChr m:val=")"/>
+                      </m:dPr>
+                      <m:e>
+                        <m:r>
+                          <w:rPr>
+                            <w:rFonts w:ascii="Cambria Math" w:hAnsi="Cambria Math"/>
+                          </w:rPr>
+                          <m:t xml:space="preserve">k; n, </m:t>
+                        </m:r>
+                        <m:f>
+                          <m:num>
+                            <m:r>
+                              <w:rPr>
+                                <w:rFonts w:ascii="Cambria Math" w:hAnsi="Cambria Math"/>
+                              </w:rPr>
+                              <m:t xml:space="preserve">λ</m:t>
+                            </m:r>
+                          </m:num>
+                          <m:den>
+                            <m:r>
+                              <w:rPr>
+                                <w:rFonts w:ascii="Cambria Math" w:hAnsi="Cambria Math"/>
+                              </w:rPr>
+                              <m:t xml:space="preserve">n</m:t>
+                            </m:r>
+                          </m:den>
+                        </m:f>
+                      </m:e>
+                    </m:d>
+                  </m:e>
+                </m:func>
+                <m:r>
+                  <w:rPr>
+                    <w:rFonts w:ascii="Cambria Math" w:hAnsi="Cambria Math"/>
+                  </w:rPr>
+                  <m:t xml:space="preserve">=</m:t>
+                </m:r>
+                <m:f>
+                  <m:num>
+                    <m:sSup>
+                      <m:e>
+                        <m:r>
+                          <w:rPr>
+                            <w:rFonts w:ascii="Cambria Math" w:hAnsi="Cambria Math"/>
+                          </w:rPr>
+                          <m:t xml:space="preserve">e</m:t>
+                        </m:r>
+                      </m:e>
+                      <m:sup>
+                        <m:r>
+                          <w:rPr>
+                            <w:rFonts w:ascii="Cambria Math" w:hAnsi="Cambria Math"/>
+                          </w:rPr>
+                          <m:t xml:space="preserve">−λ</m:t>
+                        </m:r>
+                      </m:sup>
+                    </m:sSup>
+                    <m:sSup>
+                      <m:e>
+                        <m:r>
+                          <w:rPr>
+                            <w:rFonts w:ascii="Cambria Math" w:hAnsi="Cambria Math"/>
+                          </w:rPr>
+                          <m:t xml:space="preserve">λ</m:t>
+                        </m:r>
+                      </m:e>
+                      <m:sup>
+                        <m:r>
+                          <w:rPr>
+                            <w:rFonts w:ascii="Cambria Math" w:hAnsi="Cambria Math"/>
+                          </w:rPr>
+                          <m:t xml:space="preserve">k</m:t>
+                        </m:r>
+                      </m:sup>
+                    </m:sSup>
+                  </m:num>
+                  <m:den>
+                    <m:r>
+                      <w:rPr>
+                        <w:rFonts w:ascii="Cambria Math" w:hAnsi="Cambria Math"/>
+                      </w:rPr>
+                      <m:t xml:space="preserve">k!</m:t>
+                    </m:r>
+                  </m:den>
+                </m:f>
+                <m:r>
+                  <w:rPr>
+                    <w:rFonts w:ascii="Cambria Math" w:hAnsi="Cambria Math"/>
+                  </w:rPr>
+                  <m:t xml:space="preserve">,</m:t>
+                </m:r>
+              </m:oMath>
+            </m:oMathPara>
+          </w:p>
+        </w:tc>
+        <w:tc>
+          <w:tcPr>
+            <w:tcW w:w="900" w:type="dxa"/>
+            <w:vAlign w:val="center"/>
+          </w:tcPr>
+          <w:p>
+            <w:pPr>
+              <w:pStyle w:val="Equation"/>
+              <w:jc w:val="right"/>
+            </w:pPr>
+            <w:r>
+              <w:t xml:space="preserve">(22)</w:t>
+            </w:r>
+          </w:p>
+        </w:tc>
+      </w:tr>
+    </w:tbl>
+    <w:p>
+      <w:r>
+        <w:t xml:space="preserve">which is checked numerically for n = 1, 12, 52, 252 and 10 000. The distribution of log-wealth is a mixture of normal distributions, one for each number of crashes k:</w:t>
+      </w:r>
+    </w:p>
+    <w:tbl>
+      <w:tblPr>
+        <w:tblW w:w="9026" w:type="dxa"/>
+        <w:tblBorders>
+          <w:top w:val="nil"/>
+          <w:left w:val="nil"/>
+          <w:bottom w:val="nil"/>
+          <w:right w:val="nil"/>
+          <w:insideH w:val="nil"/>
+          <w:insideV w:val="nil"/>
+        </w:tblBorders>
+        <w:tblLayout w:type="fixed"/>
+      </w:tblPr>
+      <w:tblGrid>
+        <w:gridCol w:w="8126"/>
+        <w:gridCol w:w="900"/>
+      </w:tblGrid>
+      <w:tr>
+        <w:tc>
+          <w:tcPr>
+            <w:tcW w:w="8126" w:type="dxa"/>
+            <w:vAlign w:val="center"/>
+          </w:tcPr>
+          <w:p>
+            <w:pPr>
+              <w:pStyle w:val="Equation"/>
+            </w:pPr>
+            <m:oMathPara>
+              <m:oMath>
+                <m:sSub>
+                  <m:e>
+                    <m:r>
+                      <w:rPr>
+                        <w:rFonts w:ascii="Cambria Math" w:hAnsi="Cambria Math"/>
+                      </w:rPr>
+                      <m:t xml:space="preserve">F</m:t>
+                    </m:r>
+                  </m:e>
+                  <m:sub>
+                    <m:r>
+                      <w:rPr>
+                        <w:rFonts w:ascii="Cambria Math" w:hAnsi="Cambria Math"/>
+                      </w:rPr>
+                      <m:t xml:space="preserve">f</m:t>
+                    </m:r>
+                  </m:sub>
+                </m:sSub>
+                <m:d>
+                  <m:dPr>
+                    <m:begChr m:val="("/>
+                    <m:endChr m:val=")"/>
+                  </m:dPr>
+                  <m:e>
+                    <m:r>
+                      <w:rPr>
+                        <w:rFonts w:ascii="Cambria Math" w:hAnsi="Cambria Math"/>
+                      </w:rPr>
+                      <m:t xml:space="preserve">x</m:t>
+                    </m:r>
+                  </m:e>
+                </m:d>
+                <m:r>
+                  <w:rPr>
+                    <w:rFonts w:ascii="Cambria Math" w:hAnsi="Cambria Math"/>
+                  </w:rPr>
+                  <m:t xml:space="preserve">=</m:t>
+                </m:r>
+                <m:nary>
+                  <m:naryPr>
+                    <m:chr m:val="∑"/>
+                    <m:limLoc m:val="undOvr"/>
+                  </m:naryPr>
+                  <m:sub>
+                    <m:r>
+                      <w:rPr>
+                        <w:rFonts w:ascii="Cambria Math" w:hAnsi="Cambria Math"/>
+                      </w:rPr>
+                      <m:t xml:space="preserve">k=0</m:t>
+                    </m:r>
+                  </m:sub>
+                  <m:sup>
+                    <m:r>
+                      <w:rPr>
+                        <w:rFonts w:ascii="Cambria Math" w:hAnsi="Cambria Math"/>
+                      </w:rPr>
+                      <m:t xml:space="preserve">∞</m:t>
+                    </m:r>
+                  </m:sup>
+                  <m:e>
+                    <m:r>
+                      <w:rPr>
+                        <w:rFonts w:ascii="Cambria Math" w:hAnsi="Cambria Math"/>
+                      </w:rPr>
+                      <m:t xml:space="preserve">P</m:t>
+                    </m:r>
+                    <m:d>
+                      <m:dPr>
+                        <m:begChr m:val="("/>
+                        <m:endChr m:val=")"/>
+                      </m:dPr>
+                      <m:e>
+                        <m:r>
+                          <w:rPr>
+                            <w:rFonts w:ascii="Cambria Math" w:hAnsi="Cambria Math"/>
+                          </w:rPr>
+                          <m:t xml:space="preserve">N=k</m:t>
+                        </m:r>
+                      </m:e>
+                    </m:d>
+                    <m:r>
+                      <w:rPr>
+                        <w:rFonts w:ascii="Cambria Math" w:hAnsi="Cambria Math"/>
+                      </w:rPr>
+                      <m:t xml:space="preserve">Φ</m:t>
+                    </m:r>
+                    <m:d>
+                      <m:dPr>
+                        <m:begChr m:val="("/>
+                        <m:endChr m:val=")"/>
+                      </m:dPr>
+                      <m:e>
+                        <m:f>
+                          <m:num>
+                            <m:r>
+                              <w:rPr>
+                                <w:rFonts w:ascii="Cambria Math" w:hAnsi="Cambria Math"/>
+                              </w:rPr>
+                              <m:t xml:space="preserve">x−</m:t>
+                            </m:r>
+                            <m:d>
+                              <m:dPr>
+                                <m:begChr m:val="("/>
+                                <m:endChr m:val=")"/>
+                              </m:dPr>
+                              <m:e>
+                                <m:r>
+                                  <w:rPr>
+                                    <w:rFonts w:ascii="Cambria Math" w:hAnsi="Cambria Math"/>
+                                  </w:rPr>
+                                  <m:t xml:space="preserve">g</m:t>
+                                </m:r>
+                                <m:d>
+                                  <m:dPr>
+                                    <m:begChr m:val="("/>
+                                    <m:endChr m:val=")"/>
+                                  </m:dPr>
+                                  <m:e>
+                                    <m:r>
+                                      <w:rPr>
+                                        <w:rFonts w:ascii="Cambria Math" w:hAnsi="Cambria Math"/>
+                                      </w:rPr>
+                                      <m:t xml:space="preserve">f</m:t>
+                                    </m:r>
+                                  </m:e>
+                                </m:d>
+                                <m:r>
+                                  <w:rPr>
+                                    <w:rFonts w:ascii="Cambria Math" w:hAnsi="Cambria Math"/>
+                                  </w:rPr>
+                                  <m:t xml:space="preserve">−λJf</m:t>
+                                </m:r>
+                              </m:e>
+                            </m:d>
+                            <m:r>
+                              <w:rPr>
+                                <w:rFonts w:ascii="Cambria Math" w:hAnsi="Cambria Math"/>
+                              </w:rPr>
+                              <m:t xml:space="preserve">T−k</m:t>
+                            </m:r>
+                            <m:func>
+                              <m:fName>
+                                <m:r>
+                                  <m:rPr>
+                                    <m:sty m:val="p"/>
+                                  </m:rPr>
+                                  <w:rPr>
+                                    <w:rFonts w:ascii="Cambria Math" w:hAnsi="Cambria Math"/>
+                                  </w:rPr>
+                                  <m:t xml:space="preserve">ln</m:t>
+                                </m:r>
+                              </m:fName>
+                              <m:e>
+                                <m:d>
+                                  <m:dPr>
+                                    <m:begChr m:val="("/>
+                                    <m:endChr m:val=")"/>
+                                  </m:dPr>
+                                  <m:e>
+                                    <m:r>
+                                      <w:rPr>
+                                        <w:rFonts w:ascii="Cambria Math" w:hAnsi="Cambria Math"/>
+                                      </w:rPr>
+                                      <m:t xml:space="preserve">1+fJ</m:t>
+                                    </m:r>
+                                  </m:e>
+                                </m:d>
+                              </m:e>
+                            </m:func>
+                          </m:num>
+                          <m:den>
+                            <m:r>
+                              <w:rPr>
+                                <w:rFonts w:ascii="Cambria Math" w:hAnsi="Cambria Math"/>
+                              </w:rPr>
+                              <m:t xml:space="preserve">fσ</m:t>
+                            </m:r>
+                            <m:rad>
+                              <m:radPr>
+                                <m:degHide m:val="1"/>
+                              </m:radPr>
+                              <m:deg/>
+                              <m:e>
+                                <m:r>
+                                  <w:rPr>
+                                    <w:rFonts w:ascii="Cambria Math" w:hAnsi="Cambria Math"/>
+                                  </w:rPr>
+                                  <m:t xml:space="preserve">T</m:t>
+                                </m:r>
+                              </m:e>
+                            </m:rad>
+                          </m:den>
+                        </m:f>
+                      </m:e>
+                    </m:d>
+                  </m:e>
+                </m:nary>
+                <m:r>
+                  <w:rPr>
+                    <w:rFonts w:ascii="Cambria Math" w:hAnsi="Cambria Math"/>
+                  </w:rPr>
+                  <m:t xml:space="preserve">.</m:t>
+                </m:r>
+              </m:oMath>
+            </m:oMathPara>
+          </w:p>
+        </w:tc>
+        <w:tc>
+          <w:tcPr>
+            <w:tcW w:w="900" w:type="dxa"/>
+            <w:vAlign w:val="center"/>
+          </w:tcPr>
+          <w:p>
+            <w:pPr>
+              <w:pStyle w:val="Equation"/>
+              <w:jc w:val="right"/>
+            </w:pPr>
+            <w:r>
+              <w:t xml:space="preserve">(23)</w:t>
+            </w:r>
+          </w:p>
+        </w:tc>
+      </w:tr>
+    </w:tbl>
+    <w:p>
+      <w:r>
+        <w:t xml:space="preserve">The sum is truncated at k = 30, where the omitted Poisson weights are negligible. The mixture (23) has no closed-form inverse, so the IVT is used twice:</w:t>
+      </w:r>
+    </w:p>
+    <w:p>
+      <w:pPr>
+        <w:pStyle w:val="ListParagraph"/>
+        <w:numPr>
+          <w:ilvl w:val="0"/>
+          <w:numId w:val="1"/>
+        </w:numPr>
+      </w:pPr>
+      <w:r>
+        <w:rPr>
+          <w:b/>
+        </w:rPr>
+        <w:t xml:space="preserve">Quantile: </w:t>
+      </w:r>
+      <m:oMath>
+        <m:sSub>
+          <m:e>
+            <m:r>
+              <w:rPr>
+                <w:rFonts w:ascii="Cambria Math" w:hAnsi="Cambria Math"/>
+              </w:rPr>
+              <m:t xml:space="preserve">F</m:t>
+            </m:r>
+          </m:e>
+          <m:sub>
+            <m:r>
+              <w:rPr>
+                <w:rFonts w:ascii="Cambria Math" w:hAnsi="Cambria Math"/>
+              </w:rPr>
+              <m:t xml:space="preserve">f</m:t>
+            </m:r>
+          </m:sub>
+        </m:sSub>
+      </m:oMath>
+      <w:r>
+        <w:t xml:space="preserve"> is continuous and strictly increasing from 0 to 1, so </w:t>
+      </w:r>
+      <m:oMath>
+        <m:sSub>
+          <m:e>
+            <m:r>
+              <w:rPr>
+                <w:rFonts w:ascii="Cambria Math" w:hAnsi="Cambria Math"/>
+              </w:rPr>
+              <m:t xml:space="preserve">F</m:t>
+            </m:r>
+          </m:e>
+          <m:sub>
+            <m:r>
+              <w:rPr>
+                <w:rFonts w:ascii="Cambria Math" w:hAnsi="Cambria Math"/>
+              </w:rPr>
+              <m:t xml:space="preserve">f</m:t>
+            </m:r>
+          </m:sub>
+        </m:sSub>
+        <m:d>
+          <m:dPr>
+            <m:begChr m:val="("/>
+            <m:endChr m:val=")"/>
+          </m:dPr>
+          <m:e>
+            <m:r>
+              <w:rPr>
+                <w:rFonts w:ascii="Cambria Math" w:hAnsi="Cambria Math"/>
+              </w:rPr>
+              <m:t xml:space="preserve">x</m:t>
+            </m:r>
+          </m:e>
+        </m:d>
+        <m:r>
+          <w:rPr>
+            <w:rFonts w:ascii="Cambria Math" w:hAnsi="Cambria Math"/>
+          </w:rPr>
+          <m:t xml:space="preserve">=1−α</m:t>
+        </m:r>
+      </m:oMath>
+      <w:r>
+        <w:t xml:space="preserve"> has a unique solution, found by bisection. This gives </w:t>
+      </w:r>
+      <m:oMath>
+        <m:sSubSup>
+          <m:e>
+            <m:r>
+              <m:rPr>
+                <m:sty m:val="p"/>
+              </m:rPr>
+              <w:rPr>
+                <w:rFonts w:ascii="Cambria Math" w:hAnsi="Cambria Math"/>
+              </w:rPr>
+              <m:t xml:space="preserve">VaR</m:t>
+            </m:r>
+          </m:e>
+          <m:sub>
+            <m:r>
+              <w:rPr>
+                <w:rFonts w:ascii="Cambria Math" w:hAnsi="Cambria Math"/>
+              </w:rPr>
+              <m:t xml:space="preserve">α</m:t>
+            </m:r>
+          </m:sub>
+          <m:sup>
+            <m:r>
+              <m:rPr>
+                <m:sty m:val="p"/>
+              </m:rPr>
+              <w:rPr>
+                <w:rFonts w:ascii="Cambria Math" w:hAnsi="Cambria Math"/>
+              </w:rPr>
+              <m:t xml:space="preserve">crash</m:t>
+            </m:r>
+          </m:sup>
+        </m:sSubSup>
+        <m:d>
+          <m:dPr>
+            <m:begChr m:val="("/>
+            <m:endChr m:val=")"/>
+          </m:dPr>
+          <m:e>
+            <m:r>
+              <w:rPr>
+                <w:rFonts w:ascii="Cambria Math" w:hAnsi="Cambria Math"/>
+              </w:rPr>
+              <m:t xml:space="preserve">f</m:t>
+            </m:r>
+          </m:e>
+        </m:d>
+        <m:r>
+          <w:rPr>
+            <w:rFonts w:ascii="Cambria Math" w:hAnsi="Cambria Math"/>
+          </w:rPr>
+          <m:t xml:space="preserve">=1−</m:t>
+        </m:r>
+        <m:sSup>
+          <m:e>
+            <m:r>
+              <w:rPr>
+                <w:rFonts w:ascii="Cambria Math" w:hAnsi="Cambria Math"/>
+              </w:rPr>
+              <m:t xml:space="preserve">e</m:t>
+            </m:r>
+          </m:e>
+          <m:sup>
+            <m:r>
+              <w:rPr>
+                <w:rFonts w:ascii="Cambria Math" w:hAnsi="Cambria Math"/>
+              </w:rPr>
+              <m:t xml:space="preserve">x</m:t>
+            </m:r>
+          </m:sup>
+        </m:sSup>
+      </m:oMath>
+      <w:r>
+        <w:t xml:space="preserve">.</w:t>
+      </w:r>
+    </w:p>
+    <w:p>
+      <w:pPr>
+        <w:pStyle w:val="ListParagraph"/>
+        <w:numPr>
+          <w:ilvl w:val="0"/>
+          <w:numId w:val="1"/>
+        </w:numPr>
+      </w:pPr>
+      <w:r>
+        <w:rPr>
+          <w:b/>
+        </w:rPr>
+        <w:t xml:space="preserve">Allocation: </w:t>
+      </w:r>
+      <m:oMath>
+        <m:sSubSup>
+          <m:e>
+            <m:r>
+              <m:rPr>
+                <m:sty m:val="p"/>
+              </m:rPr>
+              <w:rPr>
+                <w:rFonts w:ascii="Cambria Math" w:hAnsi="Cambria Math"/>
+              </w:rPr>
+              <m:t xml:space="preserve">VaR</m:t>
+            </m:r>
+          </m:e>
+          <m:sub>
+            <m:r>
+              <w:rPr>
+                <w:rFonts w:ascii="Cambria Math" w:hAnsi="Cambria Math"/>
+              </w:rPr>
+              <m:t xml:space="preserve">α</m:t>
+            </m:r>
+          </m:sub>
+          <m:sup>
+            <m:r>
+              <m:rPr>
+                <m:sty m:val="p"/>
+              </m:rPr>
+              <w:rPr>
+                <w:rFonts w:ascii="Cambria Math" w:hAnsi="Cambria Math"/>
+              </w:rPr>
+              <m:t xml:space="preserve">crash</m:t>
+            </m:r>
+          </m:sup>
+        </m:sSubSup>
+        <m:d>
+          <m:dPr>
+            <m:begChr m:val="("/>
+            <m:endChr m:val=")"/>
+          </m:dPr>
+          <m:e>
+            <m:r>
+              <w:rPr>
+                <w:rFonts w:ascii="Cambria Math" w:hAnsi="Cambria Math"/>
+              </w:rPr>
+              <m:t xml:space="preserve">f</m:t>
+            </m:r>
+          </m:e>
+        </m:d>
+        <m:r>
+          <w:rPr>
+            <w:rFonts w:ascii="Cambria Math" w:hAnsi="Cambria Math"/>
+          </w:rPr>
+          <m:t xml:space="preserve">−L</m:t>
+        </m:r>
+      </m:oMath>
+      <w:r>
+        <w:t xml:space="preserve"> is continuous on </w:t>
+      </w:r>
+      <m:oMath>
+        <m:d>
+          <m:dPr>
+            <m:begChr m:val="["/>
+            <m:endChr m:val="]"/>
+          </m:dPr>
+          <m:e>
+            <m:r>
+              <w:rPr>
+                <w:rFonts w:ascii="Cambria Math" w:hAnsi="Cambria Math"/>
+              </w:rPr>
+              <m:t xml:space="preserve">0, </m:t>
+            </m:r>
+            <m:sSub>
+              <m:e>
+                <m:r>
+                  <w:rPr>
+                    <w:rFonts w:ascii="Cambria Math" w:hAnsi="Cambria Math"/>
+                  </w:rPr>
+                  <m:t xml:space="preserve">f</m:t>
+                </m:r>
+              </m:e>
+              <m:sub>
+                <m:r>
+                  <m:rPr>
+                    <m:sty m:val="p"/>
+                  </m:rPr>
+                  <w:rPr>
+                    <w:rFonts w:ascii="Cambria Math" w:hAnsi="Cambria Math"/>
+                  </w:rPr>
+                  <m:t xml:space="preserve">max</m:t>
+                </m:r>
+              </m:sub>
+            </m:sSub>
+          </m:e>
+        </m:d>
+      </m:oMath>
+      <w:r>
+        <w:t xml:space="preserve"> and has the same sign change as (</w:t>
+      </w:r>
+      <w:r>
+        <w:t xml:space="preserve">17</w:t>
+      </w:r>
+      <w:r>
+        <w:t xml:space="preserve">), so a second bisection gives </w:t>
+      </w:r>
+      <m:oMath>
+        <m:sSub>
+          <m:e>
+            <m:r>
+              <w:rPr>
+                <w:rFonts w:ascii="Cambria Math" w:hAnsi="Cambria Math"/>
+              </w:rPr>
+              <m:t xml:space="preserve">f</m:t>
+            </m:r>
+          </m:e>
+          <m:sub>
+            <m:r>
+              <m:rPr>
+                <m:sty m:val="p"/>
+              </m:rPr>
+              <w:rPr>
+                <w:rFonts w:ascii="Cambria Math" w:hAnsi="Cambria Math"/>
+              </w:rPr>
+              <m:t xml:space="preserve">crash</m:t>
+            </m:r>
+          </m:sub>
+        </m:sSub>
+      </m:oMath>
+      <w:r>
+        <w:t xml:space="preserve">.</w:t>
+      </w:r>
+    </w:p>
+    <w:p>
+      <w:r>
+        <w:t xml:space="preserve">With λ = 0 every formula reduces exactly to Section 3.4.3, which is used as a test. The result is verified by Monte Carlo as in Section 3.4.5, now with a crash coin-flip of probability λΔt in every step.</w:t>
+      </w:r>
+    </w:p>
+    <w:p>
+      <w:pPr>
         <w:pStyle w:val="Heading2"/>
       </w:pPr>
       <w:r>
@@ -7273,7 +8318,7 @@
               <w:jc w:val="right"/>
             </w:pPr>
             <w:r>
-              <w:t xml:space="preserve">(21)</w:t>
+              <w:t xml:space="preserve">(24)</w:t>
             </w:r>
           </w:p>
         </w:tc>
@@ -7454,7 +8499,7 @@
               <w:jc w:val="right"/>
             </w:pPr>
             <w:r>
-              <w:t xml:space="preserve">(22)</w:t>
+              <w:t xml:space="preserve">(25)</w:t>
             </w:r>
           </w:p>
         </w:tc>
@@ -7885,6 +8930,63 @@
         <w:tc>
           <w:tcPr>
             <w:tcW w:w="1000" w:type="dxa"/>
+          </w:tcPr>
+          <w:p>
+            <w:pPr>
+              <w:pStyle w:val="TableText"/>
+            </w:pPr>
+            <w:r>
+              <w:t xml:space="preserve">4</w:t>
+            </w:r>
+          </w:p>
+        </w:tc>
+        <w:tc>
+          <w:tcPr>
+            <w:tcW w:w="4126" w:type="dxa"/>
+          </w:tcPr>
+          <w:p>
+            <w:pPr>
+              <w:pStyle w:val="TableText"/>
+            </w:pPr>
+            <w:r>
+              <w:t xml:space="preserve">Monte Carlo paths; random seed</w:t>
+            </w:r>
+          </w:p>
+        </w:tc>
+        <w:tc>
+          <w:tcPr>
+            <w:tcW w:w="1700" w:type="dxa"/>
+          </w:tcPr>
+          <w:p>
+            <w:pPr>
+              <w:pStyle w:val="TableText"/>
+            </w:pPr>
+            <w:r>
+              <w:t xml:space="preserve">–</w:t>
+            </w:r>
+          </w:p>
+        </w:tc>
+        <w:tc>
+          <w:tcPr>
+            <w:tcW w:w="2200" w:type="dxa"/>
+          </w:tcPr>
+          <w:p>
+            <w:pPr>
+              <w:pStyle w:val="TableText"/>
+            </w:pPr>
+            <w:r>
+              <w:t xml:space="preserve">20 000; 42</w:t>
+            </w:r>
+          </w:p>
+        </w:tc>
+      </w:tr>
+      <w:tr>
+        <w:trPr>
+          <w:cantSplit/>
+        </w:trPr>
+        <w:tc>
+          <w:tcPr>
+            <w:tcW w:w="1000" w:type="dxa"/>
             <w:tcBorders>
               <w:bottom w:val="single" w:sz="8" w:color="000000"/>
             </w:tcBorders>
@@ -7910,7 +9012,7 @@
               <w:pStyle w:val="TableText"/>
             </w:pPr>
             <w:r>
-              <w:t xml:space="preserve">Monte Carlo paths; random seed</w:t>
+              <w:t xml:space="preserve">Crash rate; crash size (Section 3.4.6)</w:t>
             </w:r>
           </w:p>
         </w:tc>
@@ -7926,7 +9028,7 @@
               <w:pStyle w:val="TableText"/>
             </w:pPr>
             <w:r>
-              <w:t xml:space="preserve">–</w:t>
+              <w:t xml:space="preserve">λ, J</w:t>
             </w:r>
           </w:p>
         </w:tc>
@@ -7942,7 +9044,7 @@
               <w:pStyle w:val="TableText"/>
             </w:pPr>
             <w:r>
-              <w:t xml:space="preserve">20 000; 42</w:t>
+              <w:t xml:space="preserve">0.1 per year; −25%</w:t>
             </w:r>
           </w:p>
         </w:tc>
@@ -7971,7 +9073,7 @@
     </w:p>
     <w:p>
       <w:r>
-        <w:t xml:space="preserve">Correctness is checked by an automated suite of 15 pytest tests, whose checks are repeated in a MATLAB test script, covering:</w:t>
+        <w:t xml:space="preserve">Correctness is checked by an automated suite of 19 pytest tests, whose checks are repeated in a MATLAB test script, covering:</w:t>
       </w:r>
     </w:p>
     <w:p>
@@ -8055,7 +9157,19 @@
         </w:numPr>
       </w:pPr>
       <w:r>
-        <w:t xml:space="preserve">the VaR of the risk-free portfolio, the VaR root, the non-binding case and the Monte Carlo VaR.</w:t>
+        <w:t xml:space="preserve">the VaR of the risk-free portfolio, the VaR root, the non-binding case and the Monte Carlo VaR;</w:t>
+      </w:r>
+    </w:p>
+    <w:p>
+      <w:pPr>
+        <w:pStyle w:val="ListParagraph"/>
+        <w:numPr>
+          <w:ilvl w:val="0"/>
+          <w:numId w:val="1"/>
+        </w:numPr>
+      </w:pPr>
+      <w:r>
+        <w:t xml:space="preserve">the crash model: reduction to the normal VaR when λ = 0, the binomial → Poisson limit, the crash-aware VaR root and its Monte Carlo check.</w:t>
       </w:r>
     </w:p>
     <w:p>
@@ -8137,7 +9251,7 @@
     </w:p>
     <w:p>
       <w:r>
-        <w:t xml:space="preserve">The method relies on the standard assumptions of continuous-time finance: constant μ, σ and r; normally distributed log-returns; frictionless trading without transaction costs or taxes; continuous rebalancing; and unlimited borrowing at the risk-free rate. The VaR is parametric (normal), not historical, and is evaluated over a one-year horizon. These assumptions make the limits analytically tractable. Their consequences, in particular the underestimation of tail risk when real returns have fat tails, are discussed with the results.</w:t>
+        <w:t xml:space="preserve">The method relies on the standard assumptions of continuous-time finance: constant μ, σ and r; normally distributed log-returns; frictionless trading without transaction costs or taxes; continuous rebalancing; and unlimited borrowing at the risk-free rate. The VaR is parametric (normal), not historical, and is evaluated over a one-year horizon. These assumptions make the limits analytically tractable. The normality assumption is relaxed in Section 3.4.6 by adding rare crashes, whose rate and size are assumed rather than estimated. The consequences of the remaining assumptions are discussed with the results.</w:t>
       </w:r>
     </w:p>
     <w:sectPr>

</xml_diff>